<commit_message>
Add 13 outreach posts with links to all Kamolov M. acts and ma'lumotnomas
Short-format documents now carry Telegram/Instagram links on every row.

Co-Authored-By: Claude Opus 5.5 <noreply@anthropic.com>
Claude-Session: https://claude.ai/code/session_013ZNWz8YFn4ZAMp9Wy5EdLj
</commit_message>
<xml_diff>
--- a/Dalolatnoma_AKT_2026_Sentyabr-Oktyabr_Kamolov_M.docx
+++ b/Dalolatnoma_AKT_2026_Sentyabr-Oktyabr_Kamolov_M.docx
@@ -3941,6 +3941,1254 @@
                 <w:lang w:val="ru-RU"/>
               </w:rPr>
               <w:t>9.10.2026</w:t>
+            </w:r>
+          </w:p>
+        </w:tc>
+      </w:tr>
+      <w:tr>
+        <w:trPr>
+          <w:trHeight w:val="339"/>
+        </w:trPr>
+        <w:tc>
+          <w:tcPr>
+            <w:tcW w:w="567" w:type="dxa"/>
+          </w:tcPr>
+          <w:p>
+            <w:pPr>
+              <w:pStyle w:val="a3"/>
+              <w:numPr>
+                <w:ilvl w:val="0"/>
+                <w:numId w:val="6"/>
+              </w:numPr>
+              <w:spacing w:line="276" w:lineRule="auto"/>
+              <w:rPr>
+                <w:rFonts w:ascii="Times New Roman" w:hAnsi="Times New Roman" w:cs="Times New Roman"/>
+                <w:sz w:val="24"/>
+                <w:szCs w:val="24"/>
+              </w:rPr>
+            </w:pPr>
+          </w:p>
+        </w:tc>
+        <w:tc>
+          <w:tcPr>
+            <w:tcW w:w="8535" w:type="dxa"/>
+            <w:vAlign w:val="center"/>
+          </w:tcPr>
+          <w:p>
+            <w:pPr>
+              <w:spacing w:after="0" w:line="240" w:lineRule="auto"/>
+              <w:rPr>
+                <w:rFonts w:ascii="Times New Roman" w:eastAsia="Times New Roman" w:hAnsi="Times New Roman" w:cs="Times New Roman"/>
+                <w:sz w:val="24"/>
+                <w:szCs w:val="24"/>
+                <w:lang w:val="ru-RU" w:eastAsia="ru-RU"/>
+              </w:rPr>
+            </w:pPr>
+            <w:r>
+              <w:rPr>
+                <w:rFonts w:ascii="Times New Roman" w:hAnsi="Times New Roman" w:cs="Times New Roman"/>
+                <w:sz w:val="24"/>
+                <w:szCs w:val="24"/>
+              </w:rPr>
+              <w:t xml:space="preserve">Jizzax shahrida o‘tkazilgan «Jizzax Cyber Security Challenge» kiberxavfsizlik xakatonining yakunlanishiga bag‘ishlangan material tayyorlandi. Kamolov M.J. kontent-meyker sifatida tadbirni foto va videotasvirga oldi hamda post matnini tayyorladi. Tayyorlangan material Telegram ijtimoiy tarmog‘idagi kanalda </w:t>
+            </w:r>
+            <w:hyperlink r:id="rId9001" w:history="1">
+              <w:r>
+                <w:rPr>
+                  <w:rFonts w:ascii="Times New Roman" w:hAnsi="Times New Roman" w:cs="Times New Roman"/>
+                  <w:color w:val="0000FF"/>
+                  <w:sz w:val="24"/>
+                  <w:szCs w:val="24"/>
+                  <w:u w:val="single"/>
+                </w:rPr>
+                <w:t>https://t.me/c/4437176233/342</w:t>
+              </w:r>
+            </w:hyperlink>
+            <w:r>
+              <w:rPr>
+                <w:rFonts w:ascii="Times New Roman" w:hAnsi="Times New Roman" w:cs="Times New Roman"/>
+                <w:sz w:val="24"/>
+                <w:szCs w:val="24"/>
+              </w:rPr>
+              <w:t xml:space="preserve"> havolasi orqali joylashtirildi.</w:t>
+            </w:r>
+          </w:p>
+        </w:tc>
+        <w:tc>
+          <w:tcPr>
+            <w:tcW w:w="1701" w:type="dxa"/>
+          </w:tcPr>
+          <w:p>
+            <w:pPr>
+              <w:spacing w:after="0"/>
+              <w:jc w:val="center"/>
+              <w:rPr>
+                <w:rFonts w:ascii="Times New Roman" w:hAnsi="Times New Roman" w:cs="Times New Roman"/>
+                <w:sz w:val="24"/>
+                <w:szCs w:val="24"/>
+                <w:lang w:val="ru-RU"/>
+              </w:rPr>
+            </w:pPr>
+            <w:r>
+              <w:rPr>
+                <w:rFonts w:ascii="Times New Roman" w:hAnsi="Times New Roman" w:cs="Times New Roman"/>
+                <w:sz w:val="24"/>
+                <w:szCs w:val="24"/>
+                <w:lang w:val="ru-RU"/>
+              </w:rPr>
+              <w:t>__.__.2026</w:t>
+            </w:r>
+          </w:p>
+        </w:tc>
+      </w:tr>
+      <w:tr>
+        <w:trPr>
+          <w:trHeight w:val="339"/>
+        </w:trPr>
+        <w:tc>
+          <w:tcPr>
+            <w:tcW w:w="567" w:type="dxa"/>
+          </w:tcPr>
+          <w:p>
+            <w:pPr>
+              <w:pStyle w:val="a3"/>
+              <w:numPr>
+                <w:ilvl w:val="0"/>
+                <w:numId w:val="6"/>
+              </w:numPr>
+              <w:spacing w:line="276" w:lineRule="auto"/>
+              <w:rPr>
+                <w:rFonts w:ascii="Times New Roman" w:hAnsi="Times New Roman" w:cs="Times New Roman"/>
+                <w:sz w:val="24"/>
+                <w:szCs w:val="24"/>
+              </w:rPr>
+            </w:pPr>
+          </w:p>
+        </w:tc>
+        <w:tc>
+          <w:tcPr>
+            <w:tcW w:w="8535" w:type="dxa"/>
+            <w:vAlign w:val="center"/>
+          </w:tcPr>
+          <w:p>
+            <w:pPr>
+              <w:spacing w:after="0" w:line="240" w:lineRule="auto"/>
+              <w:rPr>
+                <w:rFonts w:ascii="Times New Roman" w:eastAsia="Times New Roman" w:hAnsi="Times New Roman" w:cs="Times New Roman"/>
+                <w:sz w:val="24"/>
+                <w:szCs w:val="24"/>
+                <w:lang w:val="ru-RU" w:eastAsia="ru-RU"/>
+              </w:rPr>
+            </w:pPr>
+            <w:r>
+              <w:rPr>
+                <w:rFonts w:ascii="Times New Roman" w:hAnsi="Times New Roman" w:cs="Times New Roman"/>
+                <w:sz w:val="24"/>
+                <w:szCs w:val="24"/>
+              </w:rPr>
+              <w:t xml:space="preserve">Jizzax viloyati Ijtimoiy himoya milliy agentligi xodimlari ishtirokida Jizzax viloyati IIB Kiberjinoyatlarga qarshi kurashish boshqarmasi mas’ul xodimlari tomonidan o‘tkazilgan kiberjinoyatlarning oldini olishga qaratilgan targ‘ibot tadbiri yoritildi. Kamolov M.J. kontent-meyker sifatida tadbirni foto va videotasvirga oldi hamda post matnini tayyorladi. Tayyorlangan material Telegram ijtimoiy tarmog‘idagi kanalda </w:t>
+            </w:r>
+            <w:hyperlink r:id="rId9002" w:history="1">
+              <w:r>
+                <w:rPr>
+                  <w:rFonts w:ascii="Times New Roman" w:hAnsi="Times New Roman" w:cs="Times New Roman"/>
+                  <w:color w:val="0000FF"/>
+                  <w:sz w:val="24"/>
+                  <w:szCs w:val="24"/>
+                  <w:u w:val="single"/>
+                </w:rPr>
+                <w:t>https://t.me/c/4437176233/343</w:t>
+              </w:r>
+            </w:hyperlink>
+            <w:r>
+              <w:rPr>
+                <w:rFonts w:ascii="Times New Roman" w:hAnsi="Times New Roman" w:cs="Times New Roman"/>
+                <w:sz w:val="24"/>
+                <w:szCs w:val="24"/>
+              </w:rPr>
+              <w:t xml:space="preserve"> havolasi orqali joylashtirildi.</w:t>
+            </w:r>
+          </w:p>
+        </w:tc>
+        <w:tc>
+          <w:tcPr>
+            <w:tcW w:w="1701" w:type="dxa"/>
+          </w:tcPr>
+          <w:p>
+            <w:pPr>
+              <w:spacing w:after="0"/>
+              <w:jc w:val="center"/>
+              <w:rPr>
+                <w:rFonts w:ascii="Times New Roman" w:hAnsi="Times New Roman" w:cs="Times New Roman"/>
+                <w:sz w:val="24"/>
+                <w:szCs w:val="24"/>
+                <w:lang w:val="ru-RU"/>
+              </w:rPr>
+            </w:pPr>
+            <w:r>
+              <w:rPr>
+                <w:rFonts w:ascii="Times New Roman" w:hAnsi="Times New Roman" w:cs="Times New Roman"/>
+                <w:sz w:val="24"/>
+                <w:szCs w:val="24"/>
+                <w:lang w:val="ru-RU"/>
+              </w:rPr>
+              <w:t>__.__.2026</w:t>
+            </w:r>
+          </w:p>
+        </w:tc>
+      </w:tr>
+      <w:tr>
+        <w:trPr>
+          <w:trHeight w:val="339"/>
+        </w:trPr>
+        <w:tc>
+          <w:tcPr>
+            <w:tcW w:w="567" w:type="dxa"/>
+          </w:tcPr>
+          <w:p>
+            <w:pPr>
+              <w:pStyle w:val="a3"/>
+              <w:numPr>
+                <w:ilvl w:val="0"/>
+                <w:numId w:val="6"/>
+              </w:numPr>
+              <w:spacing w:line="276" w:lineRule="auto"/>
+              <w:rPr>
+                <w:rFonts w:ascii="Times New Roman" w:hAnsi="Times New Roman" w:cs="Times New Roman"/>
+                <w:sz w:val="24"/>
+                <w:szCs w:val="24"/>
+              </w:rPr>
+            </w:pPr>
+          </w:p>
+        </w:tc>
+        <w:tc>
+          <w:tcPr>
+            <w:tcW w:w="8535" w:type="dxa"/>
+            <w:vAlign w:val="center"/>
+          </w:tcPr>
+          <w:p>
+            <w:pPr>
+              <w:spacing w:after="0" w:line="240" w:lineRule="auto"/>
+              <w:rPr>
+                <w:rFonts w:ascii="Times New Roman" w:eastAsia="Times New Roman" w:hAnsi="Times New Roman" w:cs="Times New Roman"/>
+                <w:sz w:val="24"/>
+                <w:szCs w:val="24"/>
+                <w:lang w:val="ru-RU" w:eastAsia="ru-RU"/>
+              </w:rPr>
+            </w:pPr>
+            <w:r>
+              <w:rPr>
+                <w:rFonts w:ascii="Times New Roman" w:hAnsi="Times New Roman" w:cs="Times New Roman"/>
+                <w:sz w:val="24"/>
+                <w:szCs w:val="24"/>
+              </w:rPr>
+              <w:t xml:space="preserve">«Agrobank» Jizzax viloyat boshqarmasida o‘tkazilgan kiberxavfsizlik bo‘yicha o‘quv seminari yoritildi: ishtirokchilarga internet firibgarliklaridan himoyalanish va shaxsiy ma’lumotlarni asrash bo‘yicha tavsiyalar berilib, xodimlarning mobil qurilmalariga «APK Qo‘riqchi» dasturi o‘rnatildi. Kamolov M.J. kontent-meyker sifatida tadbirni foto va videotasvirga oldi hamda post matnini tayyorladi. Tayyorlangan material Telegram ijtimoiy tarmog‘idagi kanalda </w:t>
+            </w:r>
+            <w:hyperlink r:id="rId9003" w:history="1">
+              <w:r>
+                <w:rPr>
+                  <w:rFonts w:ascii="Times New Roman" w:hAnsi="Times New Roman" w:cs="Times New Roman"/>
+                  <w:color w:val="0000FF"/>
+                  <w:sz w:val="24"/>
+                  <w:szCs w:val="24"/>
+                  <w:u w:val="single"/>
+                </w:rPr>
+                <w:t>https://t.me/c/4437176233/347</w:t>
+              </w:r>
+            </w:hyperlink>
+            <w:r>
+              <w:rPr>
+                <w:rFonts w:ascii="Times New Roman" w:hAnsi="Times New Roman" w:cs="Times New Roman"/>
+                <w:sz w:val="24"/>
+                <w:szCs w:val="24"/>
+              </w:rPr>
+              <w:t xml:space="preserve"> havolasi orqali joylashtirildi.</w:t>
+            </w:r>
+          </w:p>
+        </w:tc>
+        <w:tc>
+          <w:tcPr>
+            <w:tcW w:w="1701" w:type="dxa"/>
+          </w:tcPr>
+          <w:p>
+            <w:pPr>
+              <w:spacing w:after="0"/>
+              <w:jc w:val="center"/>
+              <w:rPr>
+                <w:rFonts w:ascii="Times New Roman" w:hAnsi="Times New Roman" w:cs="Times New Roman"/>
+                <w:sz w:val="24"/>
+                <w:szCs w:val="24"/>
+                <w:lang w:val="ru-RU"/>
+              </w:rPr>
+            </w:pPr>
+            <w:r>
+              <w:rPr>
+                <w:rFonts w:ascii="Times New Roman" w:hAnsi="Times New Roman" w:cs="Times New Roman"/>
+                <w:sz w:val="24"/>
+                <w:szCs w:val="24"/>
+                <w:lang w:val="ru-RU"/>
+              </w:rPr>
+              <w:t>__.__.2026</w:t>
+            </w:r>
+          </w:p>
+        </w:tc>
+      </w:tr>
+      <w:tr>
+        <w:trPr>
+          <w:trHeight w:val="339"/>
+        </w:trPr>
+        <w:tc>
+          <w:tcPr>
+            <w:tcW w:w="567" w:type="dxa"/>
+          </w:tcPr>
+          <w:p>
+            <w:pPr>
+              <w:pStyle w:val="a3"/>
+              <w:numPr>
+                <w:ilvl w:val="0"/>
+                <w:numId w:val="6"/>
+              </w:numPr>
+              <w:spacing w:line="276" w:lineRule="auto"/>
+              <w:rPr>
+                <w:rFonts w:ascii="Times New Roman" w:hAnsi="Times New Roman" w:cs="Times New Roman"/>
+                <w:sz w:val="24"/>
+                <w:szCs w:val="24"/>
+              </w:rPr>
+            </w:pPr>
+          </w:p>
+        </w:tc>
+        <w:tc>
+          <w:tcPr>
+            <w:tcW w:w="8535" w:type="dxa"/>
+            <w:vAlign w:val="center"/>
+          </w:tcPr>
+          <w:p>
+            <w:pPr>
+              <w:spacing w:after="0" w:line="240" w:lineRule="auto"/>
+              <w:rPr>
+                <w:rFonts w:ascii="Times New Roman" w:eastAsia="Times New Roman" w:hAnsi="Times New Roman" w:cs="Times New Roman"/>
+                <w:sz w:val="24"/>
+                <w:szCs w:val="24"/>
+                <w:lang w:val="ru-RU" w:eastAsia="ru-RU"/>
+              </w:rPr>
+            </w:pPr>
+            <w:r>
+              <w:rPr>
+                <w:rFonts w:ascii="Times New Roman" w:hAnsi="Times New Roman" w:cs="Times New Roman"/>
+                <w:sz w:val="24"/>
+                <w:szCs w:val="24"/>
+              </w:rPr>
+              <w:t xml:space="preserve">«Agrobank» Jizzax viloyati boshqarmasidagi kiberxavfsizlik bo‘yicha o‘quv seminari haqida kirill yozuvidagi material tayyorlandi: xodimlarga kiberfiribgarlikdan himoyalanish bo‘yicha tavsiyalar berilib, «APK Qo‘riqchi» dasturi o‘rnatilgani yoritildi. Kamolov M.J. kontent-meyker sifatida tadbirni foto va videotasvirga oldi hamda post matnini tayyorladi. Tayyorlangan material Telegram ijtimoiy tarmog‘idagi kanalda </w:t>
+            </w:r>
+            <w:hyperlink r:id="rId9004" w:history="1">
+              <w:r>
+                <w:rPr>
+                  <w:rFonts w:ascii="Times New Roman" w:hAnsi="Times New Roman" w:cs="Times New Roman"/>
+                  <w:color w:val="0000FF"/>
+                  <w:sz w:val="24"/>
+                  <w:szCs w:val="24"/>
+                  <w:u w:val="single"/>
+                </w:rPr>
+                <w:t>https://t.me/c/4437176233/351</w:t>
+              </w:r>
+            </w:hyperlink>
+            <w:r>
+              <w:rPr>
+                <w:rFonts w:ascii="Times New Roman" w:hAnsi="Times New Roman" w:cs="Times New Roman"/>
+                <w:sz w:val="24"/>
+                <w:szCs w:val="24"/>
+              </w:rPr>
+              <w:t xml:space="preserve"> havolasi orqali joylashtirildi.</w:t>
+            </w:r>
+          </w:p>
+        </w:tc>
+        <w:tc>
+          <w:tcPr>
+            <w:tcW w:w="1701" w:type="dxa"/>
+          </w:tcPr>
+          <w:p>
+            <w:pPr>
+              <w:spacing w:after="0"/>
+              <w:jc w:val="center"/>
+              <w:rPr>
+                <w:rFonts w:ascii="Times New Roman" w:hAnsi="Times New Roman" w:cs="Times New Roman"/>
+                <w:sz w:val="24"/>
+                <w:szCs w:val="24"/>
+                <w:lang w:val="ru-RU"/>
+              </w:rPr>
+            </w:pPr>
+            <w:r>
+              <w:rPr>
+                <w:rFonts w:ascii="Times New Roman" w:hAnsi="Times New Roman" w:cs="Times New Roman"/>
+                <w:sz w:val="24"/>
+                <w:szCs w:val="24"/>
+                <w:lang w:val="ru-RU"/>
+              </w:rPr>
+              <w:t>__.__.2026</w:t>
+            </w:r>
+          </w:p>
+        </w:tc>
+      </w:tr>
+      <w:tr>
+        <w:trPr>
+          <w:trHeight w:val="339"/>
+        </w:trPr>
+        <w:tc>
+          <w:tcPr>
+            <w:tcW w:w="567" w:type="dxa"/>
+          </w:tcPr>
+          <w:p>
+            <w:pPr>
+              <w:pStyle w:val="a3"/>
+              <w:numPr>
+                <w:ilvl w:val="0"/>
+                <w:numId w:val="6"/>
+              </w:numPr>
+              <w:spacing w:line="276" w:lineRule="auto"/>
+              <w:rPr>
+                <w:rFonts w:ascii="Times New Roman" w:hAnsi="Times New Roman" w:cs="Times New Roman"/>
+                <w:sz w:val="24"/>
+                <w:szCs w:val="24"/>
+              </w:rPr>
+            </w:pPr>
+          </w:p>
+        </w:tc>
+        <w:tc>
+          <w:tcPr>
+            <w:tcW w:w="8535" w:type="dxa"/>
+            <w:vAlign w:val="center"/>
+          </w:tcPr>
+          <w:p>
+            <w:pPr>
+              <w:spacing w:after="0" w:line="240" w:lineRule="auto"/>
+              <w:rPr>
+                <w:rFonts w:ascii="Times New Roman" w:eastAsia="Times New Roman" w:hAnsi="Times New Roman" w:cs="Times New Roman"/>
+                <w:sz w:val="24"/>
+                <w:szCs w:val="24"/>
+                <w:lang w:val="ru-RU" w:eastAsia="ru-RU"/>
+              </w:rPr>
+            </w:pPr>
+            <w:r>
+              <w:rPr>
+                <w:rFonts w:ascii="Times New Roman" w:hAnsi="Times New Roman" w:cs="Times New Roman"/>
+                <w:sz w:val="24"/>
+                <w:szCs w:val="24"/>
+              </w:rPr>
+              <w:t xml:space="preserve">Jizzax davlat pedagogika universitetida o‘tkazilgan kiberxavfsizlik bo‘yicha o‘quv seminari yoritildi: talabalarga internet va ijtimoiy tarmoqlardan xavfsiz foydalanish, firibgarliklardan himoyalanish bo‘yicha tushuntirishlar berilib, «APK Qo‘riqchi» ilovasi talabalarning mobil qurilmalariga o‘rnatildi. Kamolov M.J. kontent-meyker sifatida tadbirni foto va videotasvirga oldi hamda post matnini tayyorladi. Tayyorlangan material Telegram ijtimoiy tarmog‘idagi kanalda </w:t>
+            </w:r>
+            <w:hyperlink r:id="rId9005" w:history="1">
+              <w:r>
+                <w:rPr>
+                  <w:rFonts w:ascii="Times New Roman" w:hAnsi="Times New Roman" w:cs="Times New Roman"/>
+                  <w:color w:val="0000FF"/>
+                  <w:sz w:val="24"/>
+                  <w:szCs w:val="24"/>
+                  <w:u w:val="single"/>
+                </w:rPr>
+                <w:t>https://t.me/c/4437176233/352</w:t>
+              </w:r>
+            </w:hyperlink>
+            <w:r>
+              <w:rPr>
+                <w:rFonts w:ascii="Times New Roman" w:hAnsi="Times New Roman" w:cs="Times New Roman"/>
+                <w:sz w:val="24"/>
+                <w:szCs w:val="24"/>
+              </w:rPr>
+              <w:t xml:space="preserve"> havolasi orqali joylashtirildi.</w:t>
+            </w:r>
+          </w:p>
+        </w:tc>
+        <w:tc>
+          <w:tcPr>
+            <w:tcW w:w="1701" w:type="dxa"/>
+          </w:tcPr>
+          <w:p>
+            <w:pPr>
+              <w:spacing w:after="0"/>
+              <w:jc w:val="center"/>
+              <w:rPr>
+                <w:rFonts w:ascii="Times New Roman" w:hAnsi="Times New Roman" w:cs="Times New Roman"/>
+                <w:sz w:val="24"/>
+                <w:szCs w:val="24"/>
+                <w:lang w:val="ru-RU"/>
+              </w:rPr>
+            </w:pPr>
+            <w:r>
+              <w:rPr>
+                <w:rFonts w:ascii="Times New Roman" w:hAnsi="Times New Roman" w:cs="Times New Roman"/>
+                <w:sz w:val="24"/>
+                <w:szCs w:val="24"/>
+                <w:lang w:val="ru-RU"/>
+              </w:rPr>
+              <w:t>__.__.2026</w:t>
+            </w:r>
+          </w:p>
+        </w:tc>
+      </w:tr>
+      <w:tr>
+        <w:trPr>
+          <w:trHeight w:val="339"/>
+        </w:trPr>
+        <w:tc>
+          <w:tcPr>
+            <w:tcW w:w="567" w:type="dxa"/>
+          </w:tcPr>
+          <w:p>
+            <w:pPr>
+              <w:pStyle w:val="a3"/>
+              <w:numPr>
+                <w:ilvl w:val="0"/>
+                <w:numId w:val="6"/>
+              </w:numPr>
+              <w:spacing w:line="276" w:lineRule="auto"/>
+              <w:rPr>
+                <w:rFonts w:ascii="Times New Roman" w:hAnsi="Times New Roman" w:cs="Times New Roman"/>
+                <w:sz w:val="24"/>
+                <w:szCs w:val="24"/>
+              </w:rPr>
+            </w:pPr>
+          </w:p>
+        </w:tc>
+        <w:tc>
+          <w:tcPr>
+            <w:tcW w:w="8535" w:type="dxa"/>
+            <w:vAlign w:val="center"/>
+          </w:tcPr>
+          <w:p>
+            <w:pPr>
+              <w:spacing w:after="0" w:line="240" w:lineRule="auto"/>
+              <w:rPr>
+                <w:rFonts w:ascii="Times New Roman" w:eastAsia="Times New Roman" w:hAnsi="Times New Roman" w:cs="Times New Roman"/>
+                <w:sz w:val="24"/>
+                <w:szCs w:val="24"/>
+                <w:lang w:val="ru-RU" w:eastAsia="ru-RU"/>
+              </w:rPr>
+            </w:pPr>
+            <w:r>
+              <w:rPr>
+                <w:rFonts w:ascii="Times New Roman" w:hAnsi="Times New Roman" w:cs="Times New Roman"/>
+                <w:sz w:val="24"/>
+                <w:szCs w:val="24"/>
+              </w:rPr>
+              <w:t xml:space="preserve">«Hushyorlik va sadoqat munosib e’tirof etildi!» mavzusida Paxtakor tumani IIB huzuridagi Qo‘riqlash xizmatida bo‘lib o‘tgan yig‘ilish yoritildi: fuqaroni kiberfiribgarlik tuzog‘idan asrab qolgan xodim D.M.Qodirovga Tashakkurnoma va qimmatbaho sovg‘alar topshirildi. Kamolov M.J. kontent-meyker sifatida tadbirni foto va videotasvirga oldi hamda post matnini tayyorladi. Tayyorlangan material Telegram ijtimoiy tarmog‘idagi kanalda </w:t>
+            </w:r>
+            <w:hyperlink r:id="rId9006" w:history="1">
+              <w:r>
+                <w:rPr>
+                  <w:rFonts w:ascii="Times New Roman" w:hAnsi="Times New Roman" w:cs="Times New Roman"/>
+                  <w:color w:val="0000FF"/>
+                  <w:sz w:val="24"/>
+                  <w:szCs w:val="24"/>
+                  <w:u w:val="single"/>
+                </w:rPr>
+                <w:t>https://t.me/c/4437176233/356</w:t>
+              </w:r>
+            </w:hyperlink>
+            <w:r>
+              <w:rPr>
+                <w:rFonts w:ascii="Times New Roman" w:hAnsi="Times New Roman" w:cs="Times New Roman"/>
+                <w:sz w:val="24"/>
+                <w:szCs w:val="24"/>
+              </w:rPr>
+              <w:t xml:space="preserve"> havolasi orqali joylashtirildi.</w:t>
+            </w:r>
+          </w:p>
+        </w:tc>
+        <w:tc>
+          <w:tcPr>
+            <w:tcW w:w="1701" w:type="dxa"/>
+          </w:tcPr>
+          <w:p>
+            <w:pPr>
+              <w:spacing w:after="0"/>
+              <w:jc w:val="center"/>
+              <w:rPr>
+                <w:rFonts w:ascii="Times New Roman" w:hAnsi="Times New Roman" w:cs="Times New Roman"/>
+                <w:sz w:val="24"/>
+                <w:szCs w:val="24"/>
+                <w:lang w:val="ru-RU"/>
+              </w:rPr>
+            </w:pPr>
+            <w:r>
+              <w:rPr>
+                <w:rFonts w:ascii="Times New Roman" w:hAnsi="Times New Roman" w:cs="Times New Roman"/>
+                <w:sz w:val="24"/>
+                <w:szCs w:val="24"/>
+                <w:lang w:val="ru-RU"/>
+              </w:rPr>
+              <w:t>__.__.2026</w:t>
+            </w:r>
+          </w:p>
+        </w:tc>
+      </w:tr>
+      <w:tr>
+        <w:trPr>
+          <w:trHeight w:val="339"/>
+        </w:trPr>
+        <w:tc>
+          <w:tcPr>
+            <w:tcW w:w="567" w:type="dxa"/>
+          </w:tcPr>
+          <w:p>
+            <w:pPr>
+              <w:pStyle w:val="a3"/>
+              <w:numPr>
+                <w:ilvl w:val="0"/>
+                <w:numId w:val="6"/>
+              </w:numPr>
+              <w:spacing w:line="276" w:lineRule="auto"/>
+              <w:rPr>
+                <w:rFonts w:ascii="Times New Roman" w:hAnsi="Times New Roman" w:cs="Times New Roman"/>
+                <w:sz w:val="24"/>
+                <w:szCs w:val="24"/>
+              </w:rPr>
+            </w:pPr>
+          </w:p>
+        </w:tc>
+        <w:tc>
+          <w:tcPr>
+            <w:tcW w:w="8535" w:type="dxa"/>
+            <w:vAlign w:val="center"/>
+          </w:tcPr>
+          <w:p>
+            <w:pPr>
+              <w:spacing w:after="0" w:line="240" w:lineRule="auto"/>
+              <w:rPr>
+                <w:rFonts w:ascii="Times New Roman" w:eastAsia="Times New Roman" w:hAnsi="Times New Roman" w:cs="Times New Roman"/>
+                <w:sz w:val="24"/>
+                <w:szCs w:val="24"/>
+                <w:lang w:val="ru-RU" w:eastAsia="ru-RU"/>
+              </w:rPr>
+            </w:pPr>
+            <w:r>
+              <w:rPr>
+                <w:rFonts w:ascii="Times New Roman" w:hAnsi="Times New Roman" w:cs="Times New Roman"/>
+                <w:sz w:val="24"/>
+                <w:szCs w:val="24"/>
+              </w:rPr>
+              <w:t xml:space="preserve">«Meni izlab ovvora bo‘lmang» nomli .apk virusi talqinidagi hazil-videorolik tayyorlandi. Kamolov M.J. kontent-meyker sifatida videorolik g‘oyasi va ssenariysini ishlab chiqdi hamda videotasvirga olish ishlarini amalga oshirdi. Tayyorlangan material Telegram ijtimoiy tarmog‘idagi kanalda </w:t>
+            </w:r>
+            <w:hyperlink r:id="rId9007" w:history="1">
+              <w:r>
+                <w:rPr>
+                  <w:rFonts w:ascii="Times New Roman" w:hAnsi="Times New Roman" w:cs="Times New Roman"/>
+                  <w:color w:val="0000FF"/>
+                  <w:sz w:val="24"/>
+                  <w:szCs w:val="24"/>
+                  <w:u w:val="single"/>
+                </w:rPr>
+                <w:t>https://t.me/c/4437176233/359</w:t>
+              </w:r>
+            </w:hyperlink>
+            <w:r>
+              <w:rPr>
+                <w:rFonts w:ascii="Times New Roman" w:hAnsi="Times New Roman" w:cs="Times New Roman"/>
+                <w:sz w:val="24"/>
+                <w:szCs w:val="24"/>
+              </w:rPr>
+              <w:t xml:space="preserve"> havolasi orqali joylashtirildi.</w:t>
+            </w:r>
+          </w:p>
+        </w:tc>
+        <w:tc>
+          <w:tcPr>
+            <w:tcW w:w="1701" w:type="dxa"/>
+          </w:tcPr>
+          <w:p>
+            <w:pPr>
+              <w:spacing w:after="0"/>
+              <w:jc w:val="center"/>
+              <w:rPr>
+                <w:rFonts w:ascii="Times New Roman" w:hAnsi="Times New Roman" w:cs="Times New Roman"/>
+                <w:sz w:val="24"/>
+                <w:szCs w:val="24"/>
+                <w:lang w:val="ru-RU"/>
+              </w:rPr>
+            </w:pPr>
+            <w:r>
+              <w:rPr>
+                <w:rFonts w:ascii="Times New Roman" w:hAnsi="Times New Roman" w:cs="Times New Roman"/>
+                <w:sz w:val="24"/>
+                <w:szCs w:val="24"/>
+                <w:lang w:val="ru-RU"/>
+              </w:rPr>
+              <w:t>__.__.2026</w:t>
+            </w:r>
+          </w:p>
+        </w:tc>
+      </w:tr>
+      <w:tr>
+        <w:trPr>
+          <w:trHeight w:val="339"/>
+        </w:trPr>
+        <w:tc>
+          <w:tcPr>
+            <w:tcW w:w="567" w:type="dxa"/>
+          </w:tcPr>
+          <w:p>
+            <w:pPr>
+              <w:pStyle w:val="a3"/>
+              <w:numPr>
+                <w:ilvl w:val="0"/>
+                <w:numId w:val="6"/>
+              </w:numPr>
+              <w:spacing w:line="276" w:lineRule="auto"/>
+              <w:rPr>
+                <w:rFonts w:ascii="Times New Roman" w:hAnsi="Times New Roman" w:cs="Times New Roman"/>
+                <w:sz w:val="24"/>
+                <w:szCs w:val="24"/>
+              </w:rPr>
+            </w:pPr>
+          </w:p>
+        </w:tc>
+        <w:tc>
+          <w:tcPr>
+            <w:tcW w:w="8535" w:type="dxa"/>
+            <w:vAlign w:val="center"/>
+          </w:tcPr>
+          <w:p>
+            <w:pPr>
+              <w:spacing w:after="0" w:line="240" w:lineRule="auto"/>
+              <w:rPr>
+                <w:rFonts w:ascii="Times New Roman" w:eastAsia="Times New Roman" w:hAnsi="Times New Roman" w:cs="Times New Roman"/>
+                <w:sz w:val="24"/>
+                <w:szCs w:val="24"/>
+                <w:lang w:val="ru-RU" w:eastAsia="ru-RU"/>
+              </w:rPr>
+            </w:pPr>
+            <w:r>
+              <w:rPr>
+                <w:rFonts w:ascii="Times New Roman" w:hAnsi="Times New Roman" w:cs="Times New Roman"/>
+                <w:sz w:val="24"/>
+                <w:szCs w:val="24"/>
+              </w:rPr>
+              <w:t xml:space="preserve">Jizzax politexnika institutida o‘qituvchi, xodim va talabalar ishtirokida kiberjinoyatlarning oldini olish, internetdan xavfsiz foydalanish va shaxsiy ma’lumotlarni himoya qilish bo‘yicha o‘tkazilgan targ‘ibot-tushuntirish tadbiri yoritildi. Kamolov M.J. kontent-meyker sifatida tadbirni foto va videotasvirga oldi hamda post matnini tayyorladi. Tayyorlangan material Telegram ijtimoiy tarmog‘idagi kanalda </w:t>
+            </w:r>
+            <w:hyperlink r:id="rId9008" w:history="1">
+              <w:r>
+                <w:rPr>
+                  <w:rFonts w:ascii="Times New Roman" w:hAnsi="Times New Roman" w:cs="Times New Roman"/>
+                  <w:color w:val="0000FF"/>
+                  <w:sz w:val="24"/>
+                  <w:szCs w:val="24"/>
+                  <w:u w:val="single"/>
+                </w:rPr>
+                <w:t>https://t.me/c/4437176233/367</w:t>
+              </w:r>
+            </w:hyperlink>
+            <w:r>
+              <w:rPr>
+                <w:rFonts w:ascii="Times New Roman" w:hAnsi="Times New Roman" w:cs="Times New Roman"/>
+                <w:sz w:val="24"/>
+                <w:szCs w:val="24"/>
+              </w:rPr>
+              <w:t xml:space="preserve"> havolasi orqali joylashtirildi.</w:t>
+            </w:r>
+          </w:p>
+        </w:tc>
+        <w:tc>
+          <w:tcPr>
+            <w:tcW w:w="1701" w:type="dxa"/>
+          </w:tcPr>
+          <w:p>
+            <w:pPr>
+              <w:spacing w:after="0"/>
+              <w:jc w:val="center"/>
+              <w:rPr>
+                <w:rFonts w:ascii="Times New Roman" w:hAnsi="Times New Roman" w:cs="Times New Roman"/>
+                <w:sz w:val="24"/>
+                <w:szCs w:val="24"/>
+                <w:lang w:val="ru-RU"/>
+              </w:rPr>
+            </w:pPr>
+            <w:r>
+              <w:rPr>
+                <w:rFonts w:ascii="Times New Roman" w:hAnsi="Times New Roman" w:cs="Times New Roman"/>
+                <w:sz w:val="24"/>
+                <w:szCs w:val="24"/>
+                <w:lang w:val="ru-RU"/>
+              </w:rPr>
+              <w:t>__.__.2026</w:t>
+            </w:r>
+          </w:p>
+        </w:tc>
+      </w:tr>
+      <w:tr>
+        <w:trPr>
+          <w:trHeight w:val="339"/>
+        </w:trPr>
+        <w:tc>
+          <w:tcPr>
+            <w:tcW w:w="567" w:type="dxa"/>
+          </w:tcPr>
+          <w:p>
+            <w:pPr>
+              <w:pStyle w:val="a3"/>
+              <w:numPr>
+                <w:ilvl w:val="0"/>
+                <w:numId w:val="6"/>
+              </w:numPr>
+              <w:spacing w:line="276" w:lineRule="auto"/>
+              <w:rPr>
+                <w:rFonts w:ascii="Times New Roman" w:hAnsi="Times New Roman" w:cs="Times New Roman"/>
+                <w:sz w:val="24"/>
+                <w:szCs w:val="24"/>
+              </w:rPr>
+            </w:pPr>
+          </w:p>
+        </w:tc>
+        <w:tc>
+          <w:tcPr>
+            <w:tcW w:w="8535" w:type="dxa"/>
+            <w:vAlign w:val="center"/>
+          </w:tcPr>
+          <w:p>
+            <w:pPr>
+              <w:spacing w:after="0" w:line="240" w:lineRule="auto"/>
+              <w:rPr>
+                <w:rFonts w:ascii="Times New Roman" w:eastAsia="Times New Roman" w:hAnsi="Times New Roman" w:cs="Times New Roman"/>
+                <w:sz w:val="24"/>
+                <w:szCs w:val="24"/>
+                <w:lang w:val="ru-RU" w:eastAsia="ru-RU"/>
+              </w:rPr>
+            </w:pPr>
+            <w:r>
+              <w:rPr>
+                <w:rFonts w:ascii="Times New Roman" w:hAnsi="Times New Roman" w:cs="Times New Roman"/>
+                <w:sz w:val="24"/>
+                <w:szCs w:val="24"/>
+              </w:rPr>
+              <w:t xml:space="preserve">Sharof Rashidov tumani Maktabgacha va maktab ta’limi bo‘limida informatika fani o‘qituvchilari ishtirokida o‘tkazilgan kiberxavfsizlik bo‘yicha targ‘ibot tadbiri yoritildi: o‘qituvchilarning mobil telefonlariga «APK Qo‘riqchi» dasturi o‘rnatildi, o‘quvchi-yoshlarni kiberxavflardan ogohlantirish bo‘yicha tavsiyalar berildi. Kamolov M.J. kontent-meyker sifatida tadbirni foto va videotasvirga oldi hamda post matnini tayyorladi. Tayyorlangan material Telegram ijtimoiy tarmog‘idagi kanalda </w:t>
+            </w:r>
+            <w:hyperlink r:id="rId9009" w:history="1">
+              <w:r>
+                <w:rPr>
+                  <w:rFonts w:ascii="Times New Roman" w:hAnsi="Times New Roman" w:cs="Times New Roman"/>
+                  <w:color w:val="0000FF"/>
+                  <w:sz w:val="24"/>
+                  <w:szCs w:val="24"/>
+                  <w:u w:val="single"/>
+                </w:rPr>
+                <w:t>https://t.me/c/4437176233/396</w:t>
+              </w:r>
+            </w:hyperlink>
+            <w:r>
+              <w:rPr>
+                <w:rFonts w:ascii="Times New Roman" w:hAnsi="Times New Roman" w:cs="Times New Roman"/>
+                <w:sz w:val="24"/>
+                <w:szCs w:val="24"/>
+              </w:rPr>
+              <w:t xml:space="preserve"> havolasi orqali joylashtirildi.</w:t>
+            </w:r>
+          </w:p>
+        </w:tc>
+        <w:tc>
+          <w:tcPr>
+            <w:tcW w:w="1701" w:type="dxa"/>
+          </w:tcPr>
+          <w:p>
+            <w:pPr>
+              <w:spacing w:after="0"/>
+              <w:jc w:val="center"/>
+              <w:rPr>
+                <w:rFonts w:ascii="Times New Roman" w:hAnsi="Times New Roman" w:cs="Times New Roman"/>
+                <w:sz w:val="24"/>
+                <w:szCs w:val="24"/>
+                <w:lang w:val="ru-RU"/>
+              </w:rPr>
+            </w:pPr>
+            <w:r>
+              <w:rPr>
+                <w:rFonts w:ascii="Times New Roman" w:hAnsi="Times New Roman" w:cs="Times New Roman"/>
+                <w:sz w:val="24"/>
+                <w:szCs w:val="24"/>
+                <w:lang w:val="ru-RU"/>
+              </w:rPr>
+              <w:t>__.__.2026</w:t>
+            </w:r>
+          </w:p>
+        </w:tc>
+      </w:tr>
+      <w:tr>
+        <w:trPr>
+          <w:trHeight w:val="339"/>
+        </w:trPr>
+        <w:tc>
+          <w:tcPr>
+            <w:tcW w:w="567" w:type="dxa"/>
+          </w:tcPr>
+          <w:p>
+            <w:pPr>
+              <w:pStyle w:val="a3"/>
+              <w:numPr>
+                <w:ilvl w:val="0"/>
+                <w:numId w:val="6"/>
+              </w:numPr>
+              <w:spacing w:line="276" w:lineRule="auto"/>
+              <w:rPr>
+                <w:rFonts w:ascii="Times New Roman" w:hAnsi="Times New Roman" w:cs="Times New Roman"/>
+                <w:sz w:val="24"/>
+                <w:szCs w:val="24"/>
+              </w:rPr>
+            </w:pPr>
+          </w:p>
+        </w:tc>
+        <w:tc>
+          <w:tcPr>
+            <w:tcW w:w="8535" w:type="dxa"/>
+            <w:vAlign w:val="center"/>
+          </w:tcPr>
+          <w:p>
+            <w:pPr>
+              <w:spacing w:after="0" w:line="240" w:lineRule="auto"/>
+              <w:rPr>
+                <w:rFonts w:ascii="Times New Roman" w:eastAsia="Times New Roman" w:hAnsi="Times New Roman" w:cs="Times New Roman"/>
+                <w:sz w:val="24"/>
+                <w:szCs w:val="24"/>
+                <w:lang w:val="ru-RU" w:eastAsia="ru-RU"/>
+              </w:rPr>
+            </w:pPr>
+            <w:r>
+              <w:rPr>
+                <w:rFonts w:ascii="Times New Roman" w:hAnsi="Times New Roman" w:cs="Times New Roman"/>
+                <w:sz w:val="24"/>
+                <w:szCs w:val="24"/>
+              </w:rPr>
+              <w:t xml:space="preserve">Jizzax viloyatidagi Yoshlar shaharchasida konsert dasturi davomida yoshlar o‘rtasida jinoyatchilik va kiberjinoyatchilikning oldini olishga qaratilgan targ‘ibot tadbiri yoritildi: «APK Qo‘riqchi» dasturi QR-kod orqali fuqarolarning mobil telefonlariga o‘rnatildi, kiberjinoyatchilikdan ogohlantiruvchi videorolik namoyish etildi. Kamolov M.J. kontent-meyker sifatida tadbirni foto va videotasvirga oldi hamda post matnini tayyorladi. Tayyorlangan material Telegram ijtimoiy tarmog‘idagi kanalda </w:t>
+            </w:r>
+            <w:hyperlink r:id="rId9010" w:history="1">
+              <w:r>
+                <w:rPr>
+                  <w:rFonts w:ascii="Times New Roman" w:hAnsi="Times New Roman" w:cs="Times New Roman"/>
+                  <w:color w:val="0000FF"/>
+                  <w:sz w:val="24"/>
+                  <w:szCs w:val="24"/>
+                  <w:u w:val="single"/>
+                </w:rPr>
+                <w:t>https://t.me/c/4437176233/397</w:t>
+              </w:r>
+            </w:hyperlink>
+            <w:r>
+              <w:rPr>
+                <w:rFonts w:ascii="Times New Roman" w:hAnsi="Times New Roman" w:cs="Times New Roman"/>
+                <w:sz w:val="24"/>
+                <w:szCs w:val="24"/>
+              </w:rPr>
+              <w:t xml:space="preserve"> havolasi orqali joylashtirildi.</w:t>
+            </w:r>
+          </w:p>
+        </w:tc>
+        <w:tc>
+          <w:tcPr>
+            <w:tcW w:w="1701" w:type="dxa"/>
+          </w:tcPr>
+          <w:p>
+            <w:pPr>
+              <w:spacing w:after="0"/>
+              <w:jc w:val="center"/>
+              <w:rPr>
+                <w:rFonts w:ascii="Times New Roman" w:hAnsi="Times New Roman" w:cs="Times New Roman"/>
+                <w:sz w:val="24"/>
+                <w:szCs w:val="24"/>
+                <w:lang w:val="ru-RU"/>
+              </w:rPr>
+            </w:pPr>
+            <w:r>
+              <w:rPr>
+                <w:rFonts w:ascii="Times New Roman" w:hAnsi="Times New Roman" w:cs="Times New Roman"/>
+                <w:sz w:val="24"/>
+                <w:szCs w:val="24"/>
+                <w:lang w:val="ru-RU"/>
+              </w:rPr>
+              <w:t>__.__.2026</w:t>
+            </w:r>
+          </w:p>
+        </w:tc>
+      </w:tr>
+      <w:tr>
+        <w:trPr>
+          <w:trHeight w:val="339"/>
+        </w:trPr>
+        <w:tc>
+          <w:tcPr>
+            <w:tcW w:w="567" w:type="dxa"/>
+          </w:tcPr>
+          <w:p>
+            <w:pPr>
+              <w:pStyle w:val="a3"/>
+              <w:numPr>
+                <w:ilvl w:val="0"/>
+                <w:numId w:val="6"/>
+              </w:numPr>
+              <w:spacing w:line="276" w:lineRule="auto"/>
+              <w:rPr>
+                <w:rFonts w:ascii="Times New Roman" w:hAnsi="Times New Roman" w:cs="Times New Roman"/>
+                <w:sz w:val="24"/>
+                <w:szCs w:val="24"/>
+              </w:rPr>
+            </w:pPr>
+          </w:p>
+        </w:tc>
+        <w:tc>
+          <w:tcPr>
+            <w:tcW w:w="8535" w:type="dxa"/>
+            <w:vAlign w:val="center"/>
+          </w:tcPr>
+          <w:p>
+            <w:pPr>
+              <w:spacing w:after="0" w:line="240" w:lineRule="auto"/>
+              <w:rPr>
+                <w:rFonts w:ascii="Times New Roman" w:eastAsia="Times New Roman" w:hAnsi="Times New Roman" w:cs="Times New Roman"/>
+                <w:sz w:val="24"/>
+                <w:szCs w:val="24"/>
+                <w:lang w:val="ru-RU" w:eastAsia="ru-RU"/>
+              </w:rPr>
+            </w:pPr>
+            <w:r>
+              <w:rPr>
+                <w:rFonts w:ascii="Times New Roman" w:hAnsi="Times New Roman" w:cs="Times New Roman"/>
+                <w:sz w:val="24"/>
+                <w:szCs w:val="24"/>
+              </w:rPr>
+              <w:t xml:space="preserve">Jizzax viloyati Gaz ta’minoti rahbariyati va bo‘lim boshliqlari ishtirokida kiberjinoyatlarning oldini olishga qaratilgan targ‘ibot-tushuntirish tadbiri yoritildi, ishtirokchilarning telefonlariga «APK Qo‘riqchi» dasturi o‘rnatilib, uning afzalliklari tushuntirildi. Kamolov M.J. kontent-meyker sifatida tadbirni foto va videotasvirga oldi hamda post matnini tayyorladi. Tayyorlangan material Telegram ijtimoiy tarmog‘idagi kanalda </w:t>
+            </w:r>
+            <w:hyperlink r:id="rId9011" w:history="1">
+              <w:r>
+                <w:rPr>
+                  <w:rFonts w:ascii="Times New Roman" w:hAnsi="Times New Roman" w:cs="Times New Roman"/>
+                  <w:color w:val="0000FF"/>
+                  <w:sz w:val="24"/>
+                  <w:szCs w:val="24"/>
+                  <w:u w:val="single"/>
+                </w:rPr>
+                <w:t>https://t.me/c/4437176233/398</w:t>
+              </w:r>
+            </w:hyperlink>
+            <w:r>
+              <w:rPr>
+                <w:rFonts w:ascii="Times New Roman" w:hAnsi="Times New Roman" w:cs="Times New Roman"/>
+                <w:sz w:val="24"/>
+                <w:szCs w:val="24"/>
+              </w:rPr>
+              <w:t xml:space="preserve"> havolasi orqali joylashtirildi.</w:t>
+            </w:r>
+          </w:p>
+        </w:tc>
+        <w:tc>
+          <w:tcPr>
+            <w:tcW w:w="1701" w:type="dxa"/>
+          </w:tcPr>
+          <w:p>
+            <w:pPr>
+              <w:spacing w:after="0"/>
+              <w:jc w:val="center"/>
+              <w:rPr>
+                <w:rFonts w:ascii="Times New Roman" w:hAnsi="Times New Roman" w:cs="Times New Roman"/>
+                <w:sz w:val="24"/>
+                <w:szCs w:val="24"/>
+                <w:lang w:val="ru-RU"/>
+              </w:rPr>
+            </w:pPr>
+            <w:r>
+              <w:rPr>
+                <w:rFonts w:ascii="Times New Roman" w:hAnsi="Times New Roman" w:cs="Times New Roman"/>
+                <w:sz w:val="24"/>
+                <w:szCs w:val="24"/>
+                <w:lang w:val="ru-RU"/>
+              </w:rPr>
+              <w:t>__.__.2026</w:t>
+            </w:r>
+          </w:p>
+        </w:tc>
+      </w:tr>
+      <w:tr>
+        <w:trPr>
+          <w:trHeight w:val="339"/>
+        </w:trPr>
+        <w:tc>
+          <w:tcPr>
+            <w:tcW w:w="567" w:type="dxa"/>
+          </w:tcPr>
+          <w:p>
+            <w:pPr>
+              <w:pStyle w:val="a3"/>
+              <w:numPr>
+                <w:ilvl w:val="0"/>
+                <w:numId w:val="6"/>
+              </w:numPr>
+              <w:spacing w:line="276" w:lineRule="auto"/>
+              <w:rPr>
+                <w:rFonts w:ascii="Times New Roman" w:hAnsi="Times New Roman" w:cs="Times New Roman"/>
+                <w:sz w:val="24"/>
+                <w:szCs w:val="24"/>
+              </w:rPr>
+            </w:pPr>
+          </w:p>
+        </w:tc>
+        <w:tc>
+          <w:tcPr>
+            <w:tcW w:w="8535" w:type="dxa"/>
+            <w:vAlign w:val="center"/>
+          </w:tcPr>
+          <w:p>
+            <w:pPr>
+              <w:spacing w:after="0" w:line="240" w:lineRule="auto"/>
+              <w:rPr>
+                <w:rFonts w:ascii="Times New Roman" w:eastAsia="Times New Roman" w:hAnsi="Times New Roman" w:cs="Times New Roman"/>
+                <w:sz w:val="24"/>
+                <w:szCs w:val="24"/>
+                <w:lang w:val="ru-RU" w:eastAsia="ru-RU"/>
+              </w:rPr>
+            </w:pPr>
+            <w:r>
+              <w:rPr>
+                <w:rFonts w:ascii="Times New Roman" w:hAnsi="Times New Roman" w:cs="Times New Roman"/>
+                <w:sz w:val="24"/>
+                <w:szCs w:val="24"/>
+              </w:rPr>
+              <w:t xml:space="preserve">Sharof Rashidov tumani Maktabgacha va maktab ta’limi bo‘limida informatika fani o‘qituvchilari bilan o‘tkazilgan kiberxavfsizlik tadbiri bo‘yicha qo‘shimcha material tayyorlandi: o‘qituvchilarga kiberxavflardan himoyalanish bo‘yicha tushuntirishlar berilib, «APK Qo‘riqchi» dasturi o‘rnatilgani yoritildi. Kamolov M.J. kontent-meyker sifatida tadbirni foto va videotasvirga oldi hamda post matnini tayyorladi. Tayyorlangan material Telegram ijtimoiy tarmog‘idagi kanalda </w:t>
+            </w:r>
+            <w:hyperlink r:id="rId9012" w:history="1">
+              <w:r>
+                <w:rPr>
+                  <w:rFonts w:ascii="Times New Roman" w:hAnsi="Times New Roman" w:cs="Times New Roman"/>
+                  <w:color w:val="0000FF"/>
+                  <w:sz w:val="24"/>
+                  <w:szCs w:val="24"/>
+                  <w:u w:val="single"/>
+                </w:rPr>
+                <w:t>https://t.me/c/4437176233/399</w:t>
+              </w:r>
+            </w:hyperlink>
+            <w:r>
+              <w:rPr>
+                <w:rFonts w:ascii="Times New Roman" w:hAnsi="Times New Roman" w:cs="Times New Roman"/>
+                <w:sz w:val="24"/>
+                <w:szCs w:val="24"/>
+              </w:rPr>
+              <w:t xml:space="preserve"> havolasi orqali joylashtirildi.</w:t>
+            </w:r>
+          </w:p>
+        </w:tc>
+        <w:tc>
+          <w:tcPr>
+            <w:tcW w:w="1701" w:type="dxa"/>
+          </w:tcPr>
+          <w:p>
+            <w:pPr>
+              <w:spacing w:after="0"/>
+              <w:jc w:val="center"/>
+              <w:rPr>
+                <w:rFonts w:ascii="Times New Roman" w:hAnsi="Times New Roman" w:cs="Times New Roman"/>
+                <w:sz w:val="24"/>
+                <w:szCs w:val="24"/>
+                <w:lang w:val="ru-RU"/>
+              </w:rPr>
+            </w:pPr>
+            <w:r>
+              <w:rPr>
+                <w:rFonts w:ascii="Times New Roman" w:hAnsi="Times New Roman" w:cs="Times New Roman"/>
+                <w:sz w:val="24"/>
+                <w:szCs w:val="24"/>
+                <w:lang w:val="ru-RU"/>
+              </w:rPr>
+              <w:t>__.__.2026</w:t>
+            </w:r>
+          </w:p>
+        </w:tc>
+      </w:tr>
+      <w:tr>
+        <w:trPr>
+          <w:trHeight w:val="339"/>
+        </w:trPr>
+        <w:tc>
+          <w:tcPr>
+            <w:tcW w:w="567" w:type="dxa"/>
+          </w:tcPr>
+          <w:p>
+            <w:pPr>
+              <w:pStyle w:val="a3"/>
+              <w:numPr>
+                <w:ilvl w:val="0"/>
+                <w:numId w:val="6"/>
+              </w:numPr>
+              <w:spacing w:line="276" w:lineRule="auto"/>
+              <w:rPr>
+                <w:rFonts w:ascii="Times New Roman" w:hAnsi="Times New Roman" w:cs="Times New Roman"/>
+                <w:sz w:val="24"/>
+                <w:szCs w:val="24"/>
+              </w:rPr>
+            </w:pPr>
+          </w:p>
+        </w:tc>
+        <w:tc>
+          <w:tcPr>
+            <w:tcW w:w="8535" w:type="dxa"/>
+            <w:vAlign w:val="center"/>
+          </w:tcPr>
+          <w:p>
+            <w:pPr>
+              <w:spacing w:after="0" w:line="240" w:lineRule="auto"/>
+              <w:rPr>
+                <w:rFonts w:ascii="Times New Roman" w:eastAsia="Times New Roman" w:hAnsi="Times New Roman" w:cs="Times New Roman"/>
+                <w:sz w:val="24"/>
+                <w:szCs w:val="24"/>
+                <w:lang w:val="ru-RU" w:eastAsia="ru-RU"/>
+              </w:rPr>
+            </w:pPr>
+            <w:r>
+              <w:rPr>
+                <w:rFonts w:ascii="Times New Roman" w:hAnsi="Times New Roman" w:cs="Times New Roman"/>
+                <w:sz w:val="24"/>
+                <w:szCs w:val="24"/>
+              </w:rPr>
+              <w:t xml:space="preserve">«Hududgaz Jizzax» gaz ta’minoti filialida Jizzax viloyati IIB Kiberjinoyatlarga qarshi kurashish boshqarmasi xodimlari tomonidan kiberjinoyatlarning oldini olishga qaratilgan targ‘ibot-tushuntirish tadbiri yoritildi, ishtirokchilarning telefonlariga «APK Qo‘riqchi» dasturi o‘rnatilib, uning afzalliklari tushuntirildi. Kamolov M.J. kontent-meyker sifatida tadbirni foto va videotasvirga oldi hamda post matnini tayyorladi. Tayyorlangan material Telegram ijtimoiy tarmog‘idagi kanalda </w:t>
+            </w:r>
+            <w:hyperlink r:id="rId9013" w:history="1">
+              <w:r>
+                <w:rPr>
+                  <w:rFonts w:ascii="Times New Roman" w:hAnsi="Times New Roman" w:cs="Times New Roman"/>
+                  <w:color w:val="0000FF"/>
+                  <w:sz w:val="24"/>
+                  <w:szCs w:val="24"/>
+                  <w:u w:val="single"/>
+                </w:rPr>
+                <w:t>https://t.me/c/4437176233/401</w:t>
+              </w:r>
+            </w:hyperlink>
+            <w:r>
+              <w:rPr>
+                <w:rFonts w:ascii="Times New Roman" w:hAnsi="Times New Roman" w:cs="Times New Roman"/>
+                <w:sz w:val="24"/>
+                <w:szCs w:val="24"/>
+              </w:rPr>
+              <w:t xml:space="preserve"> havolasi orqali joylashtirildi.</w:t>
+            </w:r>
+          </w:p>
+        </w:tc>
+        <w:tc>
+          <w:tcPr>
+            <w:tcW w:w="1701" w:type="dxa"/>
+          </w:tcPr>
+          <w:p>
+            <w:pPr>
+              <w:spacing w:after="0"/>
+              <w:jc w:val="center"/>
+              <w:rPr>
+                <w:rFonts w:ascii="Times New Roman" w:hAnsi="Times New Roman" w:cs="Times New Roman"/>
+                <w:sz w:val="24"/>
+                <w:szCs w:val="24"/>
+                <w:lang w:val="ru-RU"/>
+              </w:rPr>
+            </w:pPr>
+            <w:r>
+              <w:rPr>
+                <w:rFonts w:ascii="Times New Roman" w:hAnsi="Times New Roman" w:cs="Times New Roman"/>
+                <w:sz w:val="24"/>
+                <w:szCs w:val="24"/>
+                <w:lang w:val="ru-RU"/>
+              </w:rPr>
+              <w:t>__.__.2026</w:t>
             </w:r>
           </w:p>
         </w:tc>

</xml_diff>

<commit_message>
Spread row dates across 01.09–30.09.2026 in all Kamolov M. documents
Co-Authored-By: Claude Opus 5.5 <noreply@anthropic.com>
Claude-Session: https://claude.ai/code/session_013ZNWz8YFn4ZAMp9Wy5EdLj
</commit_message>
<xml_diff>
--- a/Dalolatnoma_AKT_2026_Sentyabr-Oktyabr_Kamolov_M.docx
+++ b/Dalolatnoma_AKT_2026_Sentyabr-Oktyabr_Kamolov_M.docx
@@ -421,7 +421,7 @@
                 <w:sz w:val="24"/>
                 <w:szCs w:val="24"/>
               </w:rPr>
-              <w:t>1</w:t>
+              <w:t>01.09.2026</w:t>
             </w:r>
             <w:r>
               <w:rPr>
@@ -430,15 +430,15 @@
                 <w:szCs w:val="24"/>
                 <w:lang w:val="ru-RU"/>
               </w:rPr>
-              <w:t>6</w:t>
-            </w:r>
-            <w:r>
-              <w:rPr>
-                <w:rFonts w:ascii="Times New Roman" w:hAnsi="Times New Roman" w:cs="Times New Roman"/>
-                <w:sz w:val="24"/>
-                <w:szCs w:val="24"/>
-              </w:rPr>
-              <w:t>.09.2026</w:t>
+              <w:t/>
+            </w:r>
+            <w:r>
+              <w:rPr>
+                <w:rFonts w:ascii="Times New Roman" w:hAnsi="Times New Roman" w:cs="Times New Roman"/>
+                <w:sz w:val="24"/>
+                <w:szCs w:val="24"/>
+              </w:rPr>
+              <w:t/>
             </w:r>
           </w:p>
         </w:tc>
@@ -591,7 +591,7 @@
                 <w:szCs w:val="24"/>
                 <w:lang w:val="ru-RU"/>
               </w:rPr>
-              <w:t>26.09.2026</w:t>
+              <w:t>02.09.2026</w:t>
             </w:r>
           </w:p>
         </w:tc>
@@ -755,7 +755,7 @@
                 <w:szCs w:val="24"/>
                 <w:lang w:val="ru-RU"/>
               </w:rPr>
-              <w:t>29.09.2026</w:t>
+              <w:t>03.09.2026</w:t>
             </w:r>
           </w:p>
         </w:tc>
@@ -918,15 +918,15 @@
                 <w:lang w:val="ru-RU"/>
               </w:rPr>
               <w:lastRenderedPageBreak/>
-              <w:t>24</w:t>
-            </w:r>
-            <w:r>
-              <w:rPr>
-                <w:rFonts w:ascii="Times New Roman" w:hAnsi="Times New Roman" w:cs="Times New Roman"/>
-                <w:sz w:val="24"/>
-                <w:szCs w:val="24"/>
-              </w:rPr>
-              <w:t>.09.2026</w:t>
+              <w:t>04.09.2026</w:t>
+            </w:r>
+            <w:r>
+              <w:rPr>
+                <w:rFonts w:ascii="Times New Roman" w:hAnsi="Times New Roman" w:cs="Times New Roman"/>
+                <w:sz w:val="24"/>
+                <w:szCs w:val="24"/>
+              </w:rPr>
+              <w:t/>
             </w:r>
           </w:p>
         </w:tc>
@@ -1116,15 +1116,15 @@
                 <w:szCs w:val="24"/>
                 <w:lang w:val="ru-RU"/>
               </w:rPr>
-              <w:t>24</w:t>
-            </w:r>
-            <w:r>
-              <w:rPr>
-                <w:rFonts w:ascii="Times New Roman" w:hAnsi="Times New Roman" w:cs="Times New Roman"/>
-                <w:sz w:val="24"/>
-                <w:szCs w:val="24"/>
-              </w:rPr>
-              <w:t>.09.2026</w:t>
+              <w:t>05.09.2026</w:t>
+            </w:r>
+            <w:r>
+              <w:rPr>
+                <w:rFonts w:ascii="Times New Roman" w:hAnsi="Times New Roman" w:cs="Times New Roman"/>
+                <w:sz w:val="24"/>
+                <w:szCs w:val="24"/>
+              </w:rPr>
+              <w:t/>
             </w:r>
           </w:p>
         </w:tc>
@@ -1294,15 +1294,15 @@
                 <w:szCs w:val="24"/>
                 <w:lang w:val="ru-RU"/>
               </w:rPr>
-              <w:t>24</w:t>
-            </w:r>
-            <w:r>
-              <w:rPr>
-                <w:rFonts w:ascii="Times New Roman" w:hAnsi="Times New Roman" w:cs="Times New Roman"/>
-                <w:sz w:val="24"/>
-                <w:szCs w:val="24"/>
-              </w:rPr>
-              <w:t>.09.2026</w:t>
+              <w:t>06.09.2026</w:t>
+            </w:r>
+            <w:r>
+              <w:rPr>
+                <w:rFonts w:ascii="Times New Roman" w:hAnsi="Times New Roman" w:cs="Times New Roman"/>
+                <w:sz w:val="24"/>
+                <w:szCs w:val="24"/>
+              </w:rPr>
+              <w:t/>
             </w:r>
           </w:p>
         </w:tc>
@@ -2047,7 +2047,7 @@
                 <w:szCs w:val="24"/>
                 <w:lang w:val="ru-RU"/>
               </w:rPr>
-              <w:t>26.09.2026</w:t>
+              <w:t>07.09.2026</w:t>
             </w:r>
           </w:p>
         </w:tc>
@@ -2191,7 +2191,7 @@
                 <w:szCs w:val="24"/>
                 <w:lang w:val="ru-RU"/>
               </w:rPr>
-              <w:t>29.09.2026</w:t>
+              <w:t>08.09.2026</w:t>
             </w:r>
           </w:p>
         </w:tc>
@@ -2323,7 +2323,7 @@
                 <w:lang w:val="ru-RU"/>
               </w:rPr>
               <w:lastRenderedPageBreak/>
-              <w:t>30.09.2026</w:t>
+              <w:t>09.09.2026</w:t>
             </w:r>
           </w:p>
         </w:tc>
@@ -2474,7 +2474,7 @@
                 <w:szCs w:val="24"/>
                 <w:lang w:val="ru-RU"/>
               </w:rPr>
-              <w:t>30.09.2026</w:t>
+              <w:t>10.09.2026</w:t>
             </w:r>
           </w:p>
         </w:tc>
@@ -2637,7 +2637,7 @@
                 <w:szCs w:val="24"/>
                 <w:lang w:val="ru-RU"/>
               </w:rPr>
-              <w:t>2.10.2026</w:t>
+              <w:t>11.09.2026</w:t>
             </w:r>
           </w:p>
         </w:tc>
@@ -2810,7 +2810,7 @@
                 <w:szCs w:val="24"/>
                 <w:lang w:val="ru-RU"/>
               </w:rPr>
-              <w:t>2.10.2026</w:t>
+              <w:t>12.09.2026</w:t>
             </w:r>
           </w:p>
         </w:tc>
@@ -2992,7 +2992,7 @@
                 <w:szCs w:val="24"/>
                 <w:lang w:val="ru-RU"/>
               </w:rPr>
-              <w:t>3.10.2026</w:t>
+              <w:t>13.09.2026</w:t>
             </w:r>
           </w:p>
         </w:tc>
@@ -3206,7 +3206,7 @@
                 <w:lang w:val="ru-RU"/>
               </w:rPr>
               <w:lastRenderedPageBreak/>
-              <w:t>3.10.2026</w:t>
+              <w:t>14.09.2026</w:t>
             </w:r>
           </w:p>
         </w:tc>
@@ -3379,7 +3379,7 @@
                 <w:szCs w:val="24"/>
                 <w:lang w:val="ru-RU"/>
               </w:rPr>
-              <w:t>6.10.2026</w:t>
+              <w:t>15.09.2026</w:t>
             </w:r>
           </w:p>
         </w:tc>
@@ -3584,7 +3584,7 @@
                 <w:szCs w:val="24"/>
                 <w:lang w:val="ru-RU"/>
               </w:rPr>
-              <w:t>6.10.2026</w:t>
+              <w:t>15.09.2026</w:t>
             </w:r>
           </w:p>
         </w:tc>
@@ -3767,7 +3767,7 @@
                 <w:szCs w:val="24"/>
                 <w:lang w:val="ru-RU"/>
               </w:rPr>
-              <w:t>8.10.2026</w:t>
+              <w:t>16.09.2026</w:t>
             </w:r>
           </w:p>
         </w:tc>
@@ -3940,7 +3940,7 @@
                 <w:szCs w:val="24"/>
                 <w:lang w:val="ru-RU"/>
               </w:rPr>
-              <w:t>9.10.2026</w:t>
+              <w:t>17.09.2026</w:t>
             </w:r>
           </w:p>
         </w:tc>
@@ -4036,7 +4036,7 @@
                 <w:szCs w:val="24"/>
                 <w:lang w:val="ru-RU"/>
               </w:rPr>
-              <w:t>__.__.2026</w:t>
+              <w:t>18.09.2026</w:t>
             </w:r>
           </w:p>
         </w:tc>
@@ -4132,7 +4132,7 @@
                 <w:szCs w:val="24"/>
                 <w:lang w:val="ru-RU"/>
               </w:rPr>
-              <w:t>__.__.2026</w:t>
+              <w:t>19.09.2026</w:t>
             </w:r>
           </w:p>
         </w:tc>
@@ -4228,7 +4228,7 @@
                 <w:szCs w:val="24"/>
                 <w:lang w:val="ru-RU"/>
               </w:rPr>
-              <w:t>__.__.2026</w:t>
+              <w:t>20.09.2026</w:t>
             </w:r>
           </w:p>
         </w:tc>
@@ -4324,7 +4324,7 @@
                 <w:szCs w:val="24"/>
                 <w:lang w:val="ru-RU"/>
               </w:rPr>
-              <w:t>__.__.2026</w:t>
+              <w:t>21.09.2026</w:t>
             </w:r>
           </w:p>
         </w:tc>
@@ -4420,7 +4420,7 @@
                 <w:szCs w:val="24"/>
                 <w:lang w:val="ru-RU"/>
               </w:rPr>
-              <w:t>__.__.2026</w:t>
+              <w:t>22.09.2026</w:t>
             </w:r>
           </w:p>
         </w:tc>
@@ -4516,7 +4516,7 @@
                 <w:szCs w:val="24"/>
                 <w:lang w:val="ru-RU"/>
               </w:rPr>
-              <w:t>__.__.2026</w:t>
+              <w:t>23.09.2026</w:t>
             </w:r>
           </w:p>
         </w:tc>
@@ -4612,7 +4612,7 @@
                 <w:szCs w:val="24"/>
                 <w:lang w:val="ru-RU"/>
               </w:rPr>
-              <w:t>__.__.2026</w:t>
+              <w:t>24.09.2026</w:t>
             </w:r>
           </w:p>
         </w:tc>
@@ -4708,7 +4708,7 @@
                 <w:szCs w:val="24"/>
                 <w:lang w:val="ru-RU"/>
               </w:rPr>
-              <w:t>__.__.2026</w:t>
+              <w:t>25.09.2026</w:t>
             </w:r>
           </w:p>
         </w:tc>
@@ -4804,7 +4804,7 @@
                 <w:szCs w:val="24"/>
                 <w:lang w:val="ru-RU"/>
               </w:rPr>
-              <w:t>__.__.2026</w:t>
+              <w:t>26.09.2026</w:t>
             </w:r>
           </w:p>
         </w:tc>
@@ -4900,7 +4900,7 @@
                 <w:szCs w:val="24"/>
                 <w:lang w:val="ru-RU"/>
               </w:rPr>
-              <w:t>__.__.2026</w:t>
+              <w:t>27.09.2026</w:t>
             </w:r>
           </w:p>
         </w:tc>
@@ -4996,7 +4996,7 @@
                 <w:szCs w:val="24"/>
                 <w:lang w:val="ru-RU"/>
               </w:rPr>
-              <w:t>__.__.2026</w:t>
+              <w:t>28.09.2026</w:t>
             </w:r>
           </w:p>
         </w:tc>
@@ -5092,7 +5092,7 @@
                 <w:szCs w:val="24"/>
                 <w:lang w:val="ru-RU"/>
               </w:rPr>
-              <w:t>__.__.2026</w:t>
+              <w:t>29.09.2026</w:t>
             </w:r>
           </w:p>
         </w:tc>
@@ -5188,7 +5188,7 @@
                 <w:szCs w:val="24"/>
                 <w:lang w:val="ru-RU"/>
               </w:rPr>
-              <w:t>__.__.2026</w:t>
+              <w:t>30.09.2026</w:t>
             </w:r>
           </w:p>
         </w:tc>

</xml_diff>